<commit_message>
Add costed materials tiers to science fair submission
Splits Materials into two tiers: what this study actually needs
(one-off, roughly $30-105) and what live deployment would additionally
require (recurring, roughly $420-760/month plus a $1,000 capital
requirement), since a live system needs a real-time feed and authorised
order routing that cannot be obtained free.

Adds a cost-justification section comparing the two, and notes that
CME began reclassifying funded prop-firm traders as Professional in
March 2026, which raises per-exchange data fees for this researcher
specifically. Cost figures are quoted as ranges with a stated caveat
that they need verifying with providers before any money is committed.

Co-Authored-By: Claude Opus 5 <noreply@anthropic.com>
Claude-Session: https://claude.ai/code/session_014uQvk7hr8taXS5B492XE5G
</commit_message>
<xml_diff>
--- a/docs/Science_Fair_Procedures.docx
+++ b/docs/Science_Fair_Procedures.docx
@@ -852,142 +852,1206 @@
     </w:p>
     <w:p>
       <w:pPr>
-        <w:spacing w:after="80" w:line="276"/>
-        <w:ind w:left="720" w:hanging="260"/>
-      </w:pPr>
-      <w:r>
-        <w:rPr>
-          <w:sz w:val="22"/>
-          <w:szCs w:val="22"/>
-        </w:rPr>
-        <w:t xml:space="preserve">— </w:t>
-      </w:r>
-      <w:r>
-        <w:rPr>
-          <w:sz w:val="22"/>
-          <w:szCs w:val="22"/>
-        </w:rPr>
-        <w:t xml:space="preserve">A computer capable of running Python 3.11 or later</w:t>
-      </w:r>
-    </w:p>
-    <w:p>
-      <w:pPr>
-        <w:spacing w:after="80" w:line="276"/>
-        <w:ind w:left="720" w:hanging="260"/>
-      </w:pPr>
-      <w:r>
-        <w:rPr>
-          <w:sz w:val="22"/>
-          <w:szCs w:val="22"/>
-        </w:rPr>
-        <w:t xml:space="preserve">— </w:t>
-      </w:r>
-      <w:r>
-        <w:rPr>
-          <w:sz w:val="22"/>
-          <w:szCs w:val="22"/>
-        </w:rPr>
-        <w:t xml:space="preserve">Python 3.11 or later</w:t>
-      </w:r>
-    </w:p>
-    <w:p>
-      <w:pPr>
-        <w:spacing w:after="80" w:line="276"/>
-        <w:ind w:left="720" w:hanging="260"/>
-      </w:pPr>
-      <w:r>
-        <w:rPr>
-          <w:sz w:val="22"/>
-          <w:szCs w:val="22"/>
-        </w:rPr>
-        <w:t xml:space="preserve">— </w:t>
-      </w:r>
-      <w:r>
-        <w:rPr>
-          <w:sz w:val="22"/>
-          <w:szCs w:val="22"/>
-        </w:rPr>
-        <w:t xml:space="preserve">The STDVBOT software package (written by the researcher for this study)</w:t>
-      </w:r>
-    </w:p>
-    <w:p>
-      <w:pPr>
-        <w:spacing w:after="80" w:line="276"/>
-        <w:ind w:left="720" w:hanging="260"/>
-      </w:pPr>
-      <w:r>
-        <w:rPr>
-          <w:sz w:val="22"/>
-          <w:szCs w:val="22"/>
-        </w:rPr>
-        <w:t xml:space="preserve">— </w:t>
-      </w:r>
-      <w:r>
-        <w:rPr>
-          <w:sz w:val="22"/>
-          <w:szCs w:val="22"/>
-        </w:rPr>
-        <w:t xml:space="preserve">24 months of 1-minute OHLCV historical price data for MNQ, in CSV format, purchased from a historical market-data vendor</w:t>
-      </w:r>
-    </w:p>
-    <w:p>
-      <w:pPr>
-        <w:spacing w:after="80" w:line="276"/>
-        <w:ind w:left="720" w:hanging="260"/>
-      </w:pPr>
-      <w:r>
-        <w:rPr>
-          <w:sz w:val="22"/>
-          <w:szCs w:val="22"/>
-        </w:rPr>
-        <w:t xml:space="preserve">— </w:t>
-      </w:r>
-      <w:r>
-        <w:rPr>
-          <w:sz w:val="22"/>
-          <w:szCs w:val="22"/>
-        </w:rPr>
-        <w:t xml:space="preserve">Approximately 2 GB of free disk space for the data file and result files</w:t>
-      </w:r>
-    </w:p>
-    <w:p>
-      <w:pPr>
-        <w:spacing w:after="80" w:line="276"/>
-        <w:ind w:left="720" w:hanging="260"/>
-      </w:pPr>
-      <w:r>
-        <w:rPr>
-          <w:sz w:val="22"/>
-          <w:szCs w:val="22"/>
-        </w:rPr>
-        <w:t xml:space="preserve">— </w:t>
-      </w:r>
-      <w:r>
-        <w:rPr>
-          <w:sz w:val="22"/>
-          <w:szCs w:val="22"/>
-        </w:rPr>
-        <w:t xml:space="preserve">A lab notebook for recording parameter values, data provenance, and observations</w:t>
-      </w:r>
-    </w:p>
-    <w:p>
-      <w:pPr>
-        <w:spacing w:after="80" w:line="276"/>
-        <w:ind w:left="720" w:hanging="260"/>
-      </w:pPr>
-      <w:r>
-        <w:rPr>
-          <w:sz w:val="22"/>
-          <w:szCs w:val="22"/>
-        </w:rPr>
-        <w:t xml:space="preserve">— </w:t>
-      </w:r>
-      <w:r>
-        <w:rPr>
-          <w:sz w:val="22"/>
-          <w:szCs w:val="22"/>
-        </w:rPr>
-        <w:t xml:space="preserve">No brokerage account, no trading API credentials, and no live market-data subscription are required at any stage</w:t>
+        <w:spacing w:after="120" w:line="276"/>
+      </w:pPr>
+      <w:r>
+        <w:rPr>
+          <w:sz w:val="22"/>
+          <w:szCs w:val="22"/>
+        </w:rPr>
+        <w:t xml:space="preserve">Costs below are separated into two tiers. Tier 1 lists everything required to carry out this study as designed. Tier 2 lists what would additionally be required to deploy the same system as a live trading bot, which this study does not do. The comparison between the two tiers is itself part of the justification for the chosen design.</w:t>
+      </w:r>
+    </w:p>
+    <w:p>
+      <w:pPr>
+        <w:pStyle w:val="Heading2"/>
+        <w:spacing w:after="120" w:before="240"/>
+      </w:pPr>
+      <w:r>
+        <w:rPr>
+          <w:b/>
+          <w:bCs/>
+          <w:color w:val="333333"/>
+          <w:sz w:val="24"/>
+          <w:szCs w:val="24"/>
+        </w:rPr>
+        <w:t xml:space="preserve">Tier 1 — Materials required for this study (historical simulation)</w:t>
+      </w:r>
+    </w:p>
+    <w:tbl>
+      <w:tblPr>
+        <w:tblW w:type="dxa" w:w="9360"/>
+        <w:tblBorders>
+          <w:top w:val="single" w:color="auto" w:sz="4"/>
+          <w:left w:val="single" w:color="auto" w:sz="4"/>
+          <w:bottom w:val="single" w:color="auto" w:sz="4"/>
+          <w:right w:val="single" w:color="auto" w:sz="4"/>
+          <w:insideH w:val="single" w:color="auto" w:sz="4"/>
+          <w:insideV w:val="single" w:color="auto" w:sz="4"/>
+        </w:tblBorders>
+      </w:tblPr>
+      <w:tblGrid>
+        <w:gridCol w:w="3060"/>
+        <w:gridCol w:w="3700"/>
+        <w:gridCol w:w="2600"/>
+      </w:tblGrid>
+      <w:tr>
+        <w:tc>
+          <w:tcPr>
+            <w:tcW w:type="dxa" w:w="3060"/>
+            <w:shd w:fill="E8E8E8" w:color="auto" w:val="clear"/>
+            <w:tcMar>
+              <w:top w:type="dxa" w:w="80"/>
+              <w:left w:type="dxa" w:w="120"/>
+              <w:bottom w:type="dxa" w:w="80"/>
+              <w:right w:type="dxa" w:w="120"/>
+            </w:tcMar>
+          </w:tcPr>
+          <w:p>
+            <w:r>
+              <w:rPr>
+                <w:b/>
+                <w:bCs/>
+                <w:sz w:val="21"/>
+                <w:szCs w:val="21"/>
+              </w:rPr>
+              <w:t xml:space="preserve">Item</w:t>
+            </w:r>
+          </w:p>
+        </w:tc>
+        <w:tc>
+          <w:tcPr>
+            <w:tcW w:type="dxa" w:w="3700"/>
+            <w:shd w:fill="E8E8E8" w:color="auto" w:val="clear"/>
+            <w:tcMar>
+              <w:top w:type="dxa" w:w="80"/>
+              <w:left w:type="dxa" w:w="120"/>
+              <w:bottom w:type="dxa" w:w="80"/>
+              <w:right w:type="dxa" w:w="120"/>
+            </w:tcMar>
+          </w:tcPr>
+          <w:p>
+            <w:r>
+              <w:rPr>
+                <w:b/>
+                <w:bCs/>
+                <w:sz w:val="21"/>
+                <w:szCs w:val="21"/>
+              </w:rPr>
+              <w:t xml:space="preserve">Purpose in the study</w:t>
+            </w:r>
+          </w:p>
+        </w:tc>
+        <w:tc>
+          <w:tcPr>
+            <w:tcW w:type="dxa" w:w="2600"/>
+            <w:shd w:fill="E8E8E8" w:color="auto" w:val="clear"/>
+            <w:tcMar>
+              <w:top w:type="dxa" w:w="80"/>
+              <w:left w:type="dxa" w:w="120"/>
+              <w:bottom w:type="dxa" w:w="80"/>
+              <w:right w:type="dxa" w:w="120"/>
+            </w:tcMar>
+          </w:tcPr>
+          <w:p>
+            <w:r>
+              <w:rPr>
+                <w:b/>
+                <w:bCs/>
+                <w:sz w:val="21"/>
+                <w:szCs w:val="21"/>
+              </w:rPr>
+              <w:t xml:space="preserve">Cost</w:t>
+            </w:r>
+          </w:p>
+        </w:tc>
+      </w:tr>
+      <w:tr>
+        <w:tc>
+          <w:tcPr>
+            <w:tcW w:type="dxa" w:w="3060"/>
+            <w:tcMar>
+              <w:top w:type="dxa" w:w="80"/>
+              <w:left w:type="dxa" w:w="120"/>
+              <w:bottom w:type="dxa" w:w="80"/>
+              <w:right w:type="dxa" w:w="120"/>
+            </w:tcMar>
+          </w:tcPr>
+          <w:p>
+            <w:r>
+              <w:rPr>
+                <w:b w:val="false"/>
+                <w:bCs w:val="false"/>
+                <w:sz w:val="21"/>
+                <w:szCs w:val="21"/>
+              </w:rPr>
+              <w:t xml:space="preserve">Computer running Python 3.11+</w:t>
+            </w:r>
+          </w:p>
+        </w:tc>
+        <w:tc>
+          <w:tcPr>
+            <w:tcW w:type="dxa" w:w="3700"/>
+            <w:tcMar>
+              <w:top w:type="dxa" w:w="80"/>
+              <w:left w:type="dxa" w:w="120"/>
+              <w:bottom w:type="dxa" w:w="80"/>
+              <w:right w:type="dxa" w:w="120"/>
+            </w:tcMar>
+          </w:tcPr>
+          <w:p>
+            <w:r>
+              <w:rPr>
+                <w:b w:val="false"/>
+                <w:bCs w:val="false"/>
+                <w:sz w:val="21"/>
+                <w:szCs w:val="21"/>
+              </w:rPr>
+              <w:t xml:space="preserve">Executes the simulation over the dataset</w:t>
+            </w:r>
+          </w:p>
+        </w:tc>
+        <w:tc>
+          <w:tcPr>
+            <w:tcW w:type="dxa" w:w="2600"/>
+            <w:tcMar>
+              <w:top w:type="dxa" w:w="80"/>
+              <w:left w:type="dxa" w:w="120"/>
+              <w:bottom w:type="dxa" w:w="80"/>
+              <w:right w:type="dxa" w:w="120"/>
+            </w:tcMar>
+          </w:tcPr>
+          <w:p>
+            <w:r>
+              <w:rPr>
+                <w:b w:val="false"/>
+                <w:bCs w:val="false"/>
+                <w:sz w:val="21"/>
+                <w:szCs w:val="21"/>
+              </w:rPr>
+              <w:t xml:space="preserve">$0 (already owned)</w:t>
+            </w:r>
+          </w:p>
+        </w:tc>
+      </w:tr>
+      <w:tr>
+        <w:tc>
+          <w:tcPr>
+            <w:tcW w:type="dxa" w:w="3060"/>
+            <w:tcMar>
+              <w:top w:type="dxa" w:w="80"/>
+              <w:left w:type="dxa" w:w="120"/>
+              <w:bottom w:type="dxa" w:w="80"/>
+              <w:right w:type="dxa" w:w="120"/>
+            </w:tcMar>
+          </w:tcPr>
+          <w:p>
+            <w:r>
+              <w:rPr>
+                <w:b w:val="false"/>
+                <w:bCs w:val="false"/>
+                <w:sz w:val="21"/>
+                <w:szCs w:val="21"/>
+              </w:rPr>
+              <w:t xml:space="preserve">Python 3.11 or later</w:t>
+            </w:r>
+          </w:p>
+        </w:tc>
+        <w:tc>
+          <w:tcPr>
+            <w:tcW w:type="dxa" w:w="3700"/>
+            <w:tcMar>
+              <w:top w:type="dxa" w:w="80"/>
+              <w:left w:type="dxa" w:w="120"/>
+              <w:bottom w:type="dxa" w:w="80"/>
+              <w:right w:type="dxa" w:w="120"/>
+            </w:tcMar>
+          </w:tcPr>
+          <w:p>
+            <w:r>
+              <w:rPr>
+                <w:b w:val="false"/>
+                <w:bCs w:val="false"/>
+                <w:sz w:val="21"/>
+                <w:szCs w:val="21"/>
+              </w:rPr>
+              <w:t xml:space="preserve">Programming environment</w:t>
+            </w:r>
+          </w:p>
+        </w:tc>
+        <w:tc>
+          <w:tcPr>
+            <w:tcW w:type="dxa" w:w="2600"/>
+            <w:tcMar>
+              <w:top w:type="dxa" w:w="80"/>
+              <w:left w:type="dxa" w:w="120"/>
+              <w:bottom w:type="dxa" w:w="80"/>
+              <w:right w:type="dxa" w:w="120"/>
+            </w:tcMar>
+          </w:tcPr>
+          <w:p>
+            <w:r>
+              <w:rPr>
+                <w:b w:val="false"/>
+                <w:bCs w:val="false"/>
+                <w:sz w:val="21"/>
+                <w:szCs w:val="21"/>
+              </w:rPr>
+              <w:t xml:space="preserve">$0 (open-source)</w:t>
+            </w:r>
+          </w:p>
+        </w:tc>
+      </w:tr>
+      <w:tr>
+        <w:tc>
+          <w:tcPr>
+            <w:tcW w:type="dxa" w:w="3060"/>
+            <w:tcMar>
+              <w:top w:type="dxa" w:w="80"/>
+              <w:left w:type="dxa" w:w="120"/>
+              <w:bottom w:type="dxa" w:w="80"/>
+              <w:right w:type="dxa" w:w="120"/>
+            </w:tcMar>
+          </w:tcPr>
+          <w:p>
+            <w:r>
+              <w:rPr>
+                <w:b w:val="false"/>
+                <w:bCs w:val="false"/>
+                <w:sz w:val="21"/>
+                <w:szCs w:val="21"/>
+              </w:rPr>
+              <w:t xml:space="preserve">STDVBOT software package</w:t>
+            </w:r>
+          </w:p>
+        </w:tc>
+        <w:tc>
+          <w:tcPr>
+            <w:tcW w:type="dxa" w:w="3700"/>
+            <w:tcMar>
+              <w:top w:type="dxa" w:w="80"/>
+              <w:left w:type="dxa" w:w="120"/>
+              <w:bottom w:type="dxa" w:w="80"/>
+              <w:right w:type="dxa" w:w="120"/>
+            </w:tcMar>
+          </w:tcPr>
+          <w:p>
+            <w:r>
+              <w:rPr>
+                <w:b w:val="false"/>
+                <w:bCs w:val="false"/>
+                <w:sz w:val="21"/>
+                <w:szCs w:val="21"/>
+              </w:rPr>
+              <w:t xml:space="preserve">The system under test; written by the researcher</w:t>
+            </w:r>
+          </w:p>
+        </w:tc>
+        <w:tc>
+          <w:tcPr>
+            <w:tcW w:type="dxa" w:w="2600"/>
+            <w:tcMar>
+              <w:top w:type="dxa" w:w="80"/>
+              <w:left w:type="dxa" w:w="120"/>
+              <w:bottom w:type="dxa" w:w="80"/>
+              <w:right w:type="dxa" w:w="120"/>
+            </w:tcMar>
+          </w:tcPr>
+          <w:p>
+            <w:r>
+              <w:rPr>
+                <w:b w:val="false"/>
+                <w:bCs w:val="false"/>
+                <w:sz w:val="21"/>
+                <w:szCs w:val="21"/>
+              </w:rPr>
+              <w:t xml:space="preserve">$0</w:t>
+            </w:r>
+          </w:p>
+        </w:tc>
+      </w:tr>
+      <w:tr>
+        <w:tc>
+          <w:tcPr>
+            <w:tcW w:type="dxa" w:w="3060"/>
+            <w:tcMar>
+              <w:top w:type="dxa" w:w="80"/>
+              <w:left w:type="dxa" w:w="120"/>
+              <w:bottom w:type="dxa" w:w="80"/>
+              <w:right w:type="dxa" w:w="120"/>
+            </w:tcMar>
+          </w:tcPr>
+          <w:p>
+            <w:r>
+              <w:rPr>
+                <w:b w:val="false"/>
+                <w:bCs w:val="false"/>
+                <w:sz w:val="21"/>
+                <w:szCs w:val="21"/>
+              </w:rPr>
+              <w:t xml:space="preserve">24 months of 1-minute OHLCV data for MNQ</w:t>
+            </w:r>
+          </w:p>
+        </w:tc>
+        <w:tc>
+          <w:tcPr>
+            <w:tcW w:type="dxa" w:w="3700"/>
+            <w:tcMar>
+              <w:top w:type="dxa" w:w="80"/>
+              <w:left w:type="dxa" w:w="120"/>
+              <w:bottom w:type="dxa" w:w="80"/>
+              <w:right w:type="dxa" w:w="120"/>
+            </w:tcMar>
+          </w:tcPr>
+          <w:p>
+            <w:r>
+              <w:rPr>
+                <w:b w:val="false"/>
+                <w:bCs w:val="false"/>
+                <w:sz w:val="21"/>
+                <w:szCs w:val="21"/>
+              </w:rPr>
+              <w:t xml:space="preserve">The dataset all three arms replay</w:t>
+            </w:r>
+          </w:p>
+        </w:tc>
+        <w:tc>
+          <w:tcPr>
+            <w:tcW w:type="dxa" w:w="2600"/>
+            <w:tcMar>
+              <w:top w:type="dxa" w:w="80"/>
+              <w:left w:type="dxa" w:w="120"/>
+              <w:bottom w:type="dxa" w:w="80"/>
+              <w:right w:type="dxa" w:w="120"/>
+            </w:tcMar>
+          </w:tcPr>
+          <w:p>
+            <w:r>
+              <w:rPr>
+                <w:b w:val="false"/>
+                <w:bCs w:val="false"/>
+                <w:sz w:val="21"/>
+                <w:szCs w:val="21"/>
+              </w:rPr>
+              <w:t xml:space="preserve">≈ $30–100 (one-off)</w:t>
+            </w:r>
+          </w:p>
+        </w:tc>
+      </w:tr>
+      <w:tr>
+        <w:tc>
+          <w:tcPr>
+            <w:tcW w:type="dxa" w:w="3060"/>
+            <w:tcMar>
+              <w:top w:type="dxa" w:w="80"/>
+              <w:left w:type="dxa" w:w="120"/>
+              <w:bottom w:type="dxa" w:w="80"/>
+              <w:right w:type="dxa" w:w="120"/>
+            </w:tcMar>
+          </w:tcPr>
+          <w:p>
+            <w:r>
+              <w:rPr>
+                <w:b w:val="false"/>
+                <w:bCs w:val="false"/>
+                <w:sz w:val="21"/>
+                <w:szCs w:val="21"/>
+              </w:rPr>
+              <w:t xml:space="preserve">≈ 2 GB free disk space</w:t>
+            </w:r>
+          </w:p>
+        </w:tc>
+        <w:tc>
+          <w:tcPr>
+            <w:tcW w:type="dxa" w:w="3700"/>
+            <w:tcMar>
+              <w:top w:type="dxa" w:w="80"/>
+              <w:left w:type="dxa" w:w="120"/>
+              <w:bottom w:type="dxa" w:w="80"/>
+              <w:right w:type="dxa" w:w="120"/>
+            </w:tcMar>
+          </w:tcPr>
+          <w:p>
+            <w:r>
+              <w:rPr>
+                <w:b w:val="false"/>
+                <w:bCs w:val="false"/>
+                <w:sz w:val="21"/>
+                <w:szCs w:val="21"/>
+              </w:rPr>
+              <w:t xml:space="preserve">Stores the dataset and result files</w:t>
+            </w:r>
+          </w:p>
+        </w:tc>
+        <w:tc>
+          <w:tcPr>
+            <w:tcW w:type="dxa" w:w="2600"/>
+            <w:tcMar>
+              <w:top w:type="dxa" w:w="80"/>
+              <w:left w:type="dxa" w:w="120"/>
+              <w:bottom w:type="dxa" w:w="80"/>
+              <w:right w:type="dxa" w:w="120"/>
+            </w:tcMar>
+          </w:tcPr>
+          <w:p>
+            <w:r>
+              <w:rPr>
+                <w:b w:val="false"/>
+                <w:bCs w:val="false"/>
+                <w:sz w:val="21"/>
+                <w:szCs w:val="21"/>
+              </w:rPr>
+              <w:t xml:space="preserve">$0</w:t>
+            </w:r>
+          </w:p>
+        </w:tc>
+      </w:tr>
+      <w:tr>
+        <w:tc>
+          <w:tcPr>
+            <w:tcW w:type="dxa" w:w="3060"/>
+            <w:tcMar>
+              <w:top w:type="dxa" w:w="80"/>
+              <w:left w:type="dxa" w:w="120"/>
+              <w:bottom w:type="dxa" w:w="80"/>
+              <w:right w:type="dxa" w:w="120"/>
+            </w:tcMar>
+          </w:tcPr>
+          <w:p>
+            <w:r>
+              <w:rPr>
+                <w:b w:val="false"/>
+                <w:bCs w:val="false"/>
+                <w:sz w:val="21"/>
+                <w:szCs w:val="21"/>
+              </w:rPr>
+              <w:t xml:space="preserve">Lab notebook</w:t>
+            </w:r>
+          </w:p>
+        </w:tc>
+        <w:tc>
+          <w:tcPr>
+            <w:tcW w:type="dxa" w:w="3700"/>
+            <w:tcMar>
+              <w:top w:type="dxa" w:w="80"/>
+              <w:left w:type="dxa" w:w="120"/>
+              <w:bottom w:type="dxa" w:w="80"/>
+              <w:right w:type="dxa" w:w="120"/>
+            </w:tcMar>
+          </w:tcPr>
+          <w:p>
+            <w:r>
+              <w:rPr>
+                <w:b w:val="false"/>
+                <w:bCs w:val="false"/>
+                <w:sz w:val="21"/>
+                <w:szCs w:val="21"/>
+              </w:rPr>
+              <w:t xml:space="preserve">Records parameters, data provenance, observations</w:t>
+            </w:r>
+          </w:p>
+        </w:tc>
+        <w:tc>
+          <w:tcPr>
+            <w:tcW w:type="dxa" w:w="2600"/>
+            <w:tcMar>
+              <w:top w:type="dxa" w:w="80"/>
+              <w:left w:type="dxa" w:w="120"/>
+              <w:bottom w:type="dxa" w:w="80"/>
+              <w:right w:type="dxa" w:w="120"/>
+            </w:tcMar>
+          </w:tcPr>
+          <w:p>
+            <w:r>
+              <w:rPr>
+                <w:b w:val="false"/>
+                <w:bCs w:val="false"/>
+                <w:sz w:val="21"/>
+                <w:szCs w:val="21"/>
+              </w:rPr>
+              <w:t xml:space="preserve">≈ $0–5</w:t>
+            </w:r>
+          </w:p>
+        </w:tc>
+      </w:tr>
+      <w:tr>
+        <w:tc>
+          <w:tcPr>
+            <w:tcW w:type="dxa" w:w="3060"/>
+            <w:shd w:fill="F4F4F4" w:color="auto" w:val="clear"/>
+            <w:tcMar>
+              <w:top w:type="dxa" w:w="80"/>
+              <w:left w:type="dxa" w:w="120"/>
+              <w:bottom w:type="dxa" w:w="80"/>
+              <w:right w:type="dxa" w:w="120"/>
+            </w:tcMar>
+          </w:tcPr>
+          <w:p>
+            <w:r>
+              <w:rPr>
+                <w:b/>
+                <w:bCs/>
+                <w:sz w:val="21"/>
+                <w:szCs w:val="21"/>
+              </w:rPr>
+              <w:t xml:space="preserve">Total</w:t>
+            </w:r>
+          </w:p>
+        </w:tc>
+        <w:tc>
+          <w:tcPr>
+            <w:tcW w:type="dxa" w:w="3700"/>
+            <w:shd w:fill="F4F4F4" w:color="auto" w:val="clear"/>
+            <w:tcMar>
+              <w:top w:type="dxa" w:w="80"/>
+              <w:left w:type="dxa" w:w="120"/>
+              <w:bottom w:type="dxa" w:w="80"/>
+              <w:right w:type="dxa" w:w="120"/>
+            </w:tcMar>
+          </w:tcPr>
+          <w:p>
+            <w:r>
+              <w:rPr>
+                <w:b w:val="false"/>
+                <w:bCs w:val="false"/>
+                <w:sz w:val="21"/>
+                <w:szCs w:val="21"/>
+              </w:rPr>
+              <w:t xml:space="preserve">One-off cost to complete the entire study</w:t>
+            </w:r>
+          </w:p>
+        </w:tc>
+        <w:tc>
+          <w:tcPr>
+            <w:tcW w:type="dxa" w:w="2600"/>
+            <w:shd w:fill="F4F4F4" w:color="auto" w:val="clear"/>
+            <w:tcMar>
+              <w:top w:type="dxa" w:w="80"/>
+              <w:left w:type="dxa" w:w="120"/>
+              <w:bottom w:type="dxa" w:w="80"/>
+              <w:right w:type="dxa" w:w="120"/>
+            </w:tcMar>
+          </w:tcPr>
+          <w:p>
+            <w:r>
+              <w:rPr>
+                <w:b/>
+                <w:bCs/>
+                <w:sz w:val="21"/>
+                <w:szCs w:val="21"/>
+              </w:rPr>
+              <w:t xml:space="preserve">≈ $30–105</w:t>
+            </w:r>
+          </w:p>
+        </w:tc>
+      </w:tr>
+    </w:tbl>
+    <w:p>
+      <w:pPr>
+        <w:spacing w:after="120" w:line="276"/>
+      </w:pPr>
+      <w:r>
+        <w:rPr>
+          <w:i/>
+          <w:iCs/>
+          <w:sz w:val="22"/>
+          <w:szCs w:val="22"/>
+        </w:rPr>
+        <w:t xml:space="preserve">No brokerage account, no trading API credentials, and no live market-data subscription are required at any stage of this study.</w:t>
+      </w:r>
+    </w:p>
+    <w:p>
+      <w:pPr>
+        <w:pStyle w:val="Heading2"/>
+        <w:spacing w:after="120" w:before="240"/>
+      </w:pPr>
+      <w:r>
+        <w:rPr>
+          <w:b/>
+          <w:bCs/>
+          <w:color w:val="333333"/>
+          <w:sz w:val="24"/>
+          <w:szCs w:val="24"/>
+        </w:rPr>
+        <w:t xml:space="preserve">Tier 2 — Additional materials required for live implementation (not undertaken in this study)</w:t>
+      </w:r>
+    </w:p>
+    <w:p>
+      <w:pPr>
+        <w:spacing w:after="120" w:line="276"/>
+      </w:pPr>
+      <w:r>
+        <w:rPr>
+          <w:sz w:val="22"/>
+          <w:szCs w:val="22"/>
+        </w:rPr>
+        <w:t xml:space="preserve">Were the system to be deployed to trade live rather than replay history, it would require a continuous real-time price feed and authorised order routing. Neither can be obtained free of charge. The following would be needed in addition to Tier 1:</w:t>
+      </w:r>
+    </w:p>
+    <w:tbl>
+      <w:tblPr>
+        <w:tblW w:type="dxa" w:w="9360"/>
+        <w:tblBorders>
+          <w:top w:val="single" w:color="auto" w:sz="4"/>
+          <w:left w:val="single" w:color="auto" w:sz="4"/>
+          <w:bottom w:val="single" w:color="auto" w:sz="4"/>
+          <w:right w:val="single" w:color="auto" w:sz="4"/>
+          <w:insideH w:val="single" w:color="auto" w:sz="4"/>
+          <w:insideV w:val="single" w:color="auto" w:sz="4"/>
+        </w:tblBorders>
+      </w:tblPr>
+      <w:tblGrid>
+        <w:gridCol w:w="3060"/>
+        <w:gridCol w:w="3700"/>
+        <w:gridCol w:w="2600"/>
+      </w:tblGrid>
+      <w:tr>
+        <w:tc>
+          <w:tcPr>
+            <w:tcW w:type="dxa" w:w="3060"/>
+            <w:shd w:fill="E8E8E8" w:color="auto" w:val="clear"/>
+            <w:tcMar>
+              <w:top w:type="dxa" w:w="80"/>
+              <w:left w:type="dxa" w:w="120"/>
+              <w:bottom w:type="dxa" w:w="80"/>
+              <w:right w:type="dxa" w:w="120"/>
+            </w:tcMar>
+          </w:tcPr>
+          <w:p>
+            <w:r>
+              <w:rPr>
+                <w:b/>
+                <w:bCs/>
+                <w:sz w:val="21"/>
+                <w:szCs w:val="21"/>
+              </w:rPr>
+              <w:t xml:space="preserve">Item</w:t>
+            </w:r>
+          </w:p>
+        </w:tc>
+        <w:tc>
+          <w:tcPr>
+            <w:tcW w:type="dxa" w:w="3700"/>
+            <w:shd w:fill="E8E8E8" w:color="auto" w:val="clear"/>
+            <w:tcMar>
+              <w:top w:type="dxa" w:w="80"/>
+              <w:left w:type="dxa" w:w="120"/>
+              <w:bottom w:type="dxa" w:w="80"/>
+              <w:right w:type="dxa" w:w="120"/>
+            </w:tcMar>
+          </w:tcPr>
+          <w:p>
+            <w:r>
+              <w:rPr>
+                <w:b/>
+                <w:bCs/>
+                <w:sz w:val="21"/>
+                <w:szCs w:val="21"/>
+              </w:rPr>
+              <w:t xml:space="preserve">Why live operation requires it</w:t>
+            </w:r>
+          </w:p>
+        </w:tc>
+        <w:tc>
+          <w:tcPr>
+            <w:tcW w:type="dxa" w:w="2600"/>
+            <w:shd w:fill="E8E8E8" w:color="auto" w:val="clear"/>
+            <w:tcMar>
+              <w:top w:type="dxa" w:w="80"/>
+              <w:left w:type="dxa" w:w="120"/>
+              <w:bottom w:type="dxa" w:w="80"/>
+              <w:right w:type="dxa" w:w="120"/>
+            </w:tcMar>
+          </w:tcPr>
+          <w:p>
+            <w:r>
+              <w:rPr>
+                <w:b/>
+                <w:bCs/>
+                <w:sz w:val="21"/>
+                <w:szCs w:val="21"/>
+              </w:rPr>
+              <w:t xml:space="preserve">Cost</w:t>
+            </w:r>
+          </w:p>
+        </w:tc>
+      </w:tr>
+      <w:tr>
+        <w:tc>
+          <w:tcPr>
+            <w:tcW w:type="dxa" w:w="3060"/>
+            <w:tcMar>
+              <w:top w:type="dxa" w:w="80"/>
+              <w:left w:type="dxa" w:w="120"/>
+              <w:bottom w:type="dxa" w:w="80"/>
+              <w:right w:type="dxa" w:w="120"/>
+            </w:tcMar>
+          </w:tcPr>
+          <w:p>
+            <w:r>
+              <w:rPr>
+                <w:b w:val="false"/>
+                <w:bCs w:val="false"/>
+                <w:sz w:val="21"/>
+                <w:szCs w:val="21"/>
+              </w:rPr>
+              <w:t xml:space="preserve">Tradovate API Access add-on</w:t>
+            </w:r>
+          </w:p>
+        </w:tc>
+        <w:tc>
+          <w:tcPr>
+            <w:tcW w:type="dxa" w:w="3700"/>
+            <w:tcMar>
+              <w:top w:type="dxa" w:w="80"/>
+              <w:left w:type="dxa" w:w="120"/>
+              <w:bottom w:type="dxa" w:w="80"/>
+              <w:right w:type="dxa" w:w="120"/>
+            </w:tcMar>
+          </w:tcPr>
+          <w:p>
+            <w:r>
+              <w:rPr>
+                <w:b w:val="false"/>
+                <w:bCs w:val="false"/>
+                <w:sz w:val="21"/>
+                <w:szCs w:val="21"/>
+              </w:rPr>
+              <w:t xml:space="preserve">Authorises the program to submit, modify and cancel orders</w:t>
+            </w:r>
+          </w:p>
+        </w:tc>
+        <w:tc>
+          <w:tcPr>
+            <w:tcW w:type="dxa" w:w="2600"/>
+            <w:tcMar>
+              <w:top w:type="dxa" w:w="80"/>
+              <w:left w:type="dxa" w:w="120"/>
+              <w:bottom w:type="dxa" w:w="80"/>
+              <w:right w:type="dxa" w:w="120"/>
+            </w:tcMar>
+          </w:tcPr>
+          <w:p>
+            <w:r>
+              <w:rPr>
+                <w:b w:val="false"/>
+                <w:bCs w:val="false"/>
+                <w:sz w:val="21"/>
+                <w:szCs w:val="21"/>
+              </w:rPr>
+              <w:t xml:space="preserve">≈ $25 / month</w:t>
+            </w:r>
+          </w:p>
+        </w:tc>
+      </w:tr>
+      <w:tr>
+        <w:tc>
+          <w:tcPr>
+            <w:tcW w:type="dxa" w:w="3060"/>
+            <w:tcMar>
+              <w:top w:type="dxa" w:w="80"/>
+              <w:left w:type="dxa" w:w="120"/>
+              <w:bottom w:type="dxa" w:w="80"/>
+              <w:right w:type="dxa" w:w="120"/>
+            </w:tcMar>
+          </w:tcPr>
+          <w:p>
+            <w:r>
+              <w:rPr>
+                <w:b w:val="false"/>
+                <w:bCs w:val="false"/>
+                <w:sz w:val="21"/>
+                <w:szCs w:val="21"/>
+              </w:rPr>
+              <w:t xml:space="preserve">Funded live brokerage account</w:t>
+            </w:r>
+          </w:p>
+        </w:tc>
+        <w:tc>
+          <w:tcPr>
+            <w:tcW w:type="dxa" w:w="3700"/>
+            <w:tcMar>
+              <w:top w:type="dxa" w:w="80"/>
+              <w:left w:type="dxa" w:w="120"/>
+              <w:bottom w:type="dxa" w:w="80"/>
+              <w:right w:type="dxa" w:w="120"/>
+            </w:tcMar>
+          </w:tcPr>
+          <w:p>
+            <w:r>
+              <w:rPr>
+                <w:b w:val="false"/>
+                <w:bCs w:val="false"/>
+                <w:sz w:val="21"/>
+                <w:szCs w:val="21"/>
+              </w:rPr>
+              <w:t xml:space="preserve">Tradovate issues an API key only to a live account holding over $1,000; simulated balances do not qualify</w:t>
+            </w:r>
+          </w:p>
+        </w:tc>
+        <w:tc>
+          <w:tcPr>
+            <w:tcW w:type="dxa" w:w="2600"/>
+            <w:tcMar>
+              <w:top w:type="dxa" w:w="80"/>
+              <w:left w:type="dxa" w:w="120"/>
+              <w:bottom w:type="dxa" w:w="80"/>
+              <w:right w:type="dxa" w:w="120"/>
+            </w:tcMar>
+          </w:tcPr>
+          <w:p>
+            <w:r>
+              <w:rPr>
+                <w:b w:val="false"/>
+                <w:bCs w:val="false"/>
+                <w:sz w:val="21"/>
+                <w:szCs w:val="21"/>
+              </w:rPr>
+              <w:t xml:space="preserve">$1,000 capital requirement (not a fee)</w:t>
+            </w:r>
+          </w:p>
+        </w:tc>
+      </w:tr>
+      <w:tr>
+        <w:tc>
+          <w:tcPr>
+            <w:tcW w:type="dxa" w:w="3060"/>
+            <w:tcMar>
+              <w:top w:type="dxa" w:w="80"/>
+              <w:left w:type="dxa" w:w="120"/>
+              <w:bottom w:type="dxa" w:w="80"/>
+              <w:right w:type="dxa" w:w="120"/>
+            </w:tcMar>
+          </w:tcPr>
+          <w:p>
+            <w:r>
+              <w:rPr>
+                <w:b w:val="false"/>
+                <w:bCs w:val="false"/>
+                <w:sz w:val="21"/>
+                <w:szCs w:val="21"/>
+              </w:rPr>
+              <w:t xml:space="preserve">Real-time CME market data</w:t>
+            </w:r>
+          </w:p>
+        </w:tc>
+        <w:tc>
+          <w:tcPr>
+            <w:tcW w:type="dxa" w:w="3700"/>
+            <w:tcMar>
+              <w:top w:type="dxa" w:w="80"/>
+              <w:left w:type="dxa" w:w="120"/>
+              <w:bottom w:type="dxa" w:w="80"/>
+              <w:right w:type="dxa" w:w="120"/>
+            </w:tcMar>
+          </w:tcPr>
+          <w:p>
+            <w:r>
+              <w:rPr>
+                <w:b w:val="false"/>
+                <w:bCs w:val="false"/>
+                <w:sz w:val="21"/>
+                <w:szCs w:val="21"/>
+              </w:rPr>
+              <w:t xml:space="preserve">Supplies the live 1-minute, 4-hour and Daily feeds the strategy reads</w:t>
+            </w:r>
+          </w:p>
+        </w:tc>
+        <w:tc>
+          <w:tcPr>
+            <w:tcW w:type="dxa" w:w="2600"/>
+            <w:tcMar>
+              <w:top w:type="dxa" w:w="80"/>
+              <w:left w:type="dxa" w:w="120"/>
+              <w:bottom w:type="dxa" w:w="80"/>
+              <w:right w:type="dxa" w:w="120"/>
+            </w:tcMar>
+          </w:tcPr>
+          <w:p>
+            <w:r>
+              <w:rPr>
+                <w:b w:val="false"/>
+                <w:bCs w:val="false"/>
+                <w:sz w:val="21"/>
+                <w:szCs w:val="21"/>
+              </w:rPr>
+              <w:t xml:space="preserve">≈ $85–135 / month</w:t>
+            </w:r>
+          </w:p>
+        </w:tc>
+      </w:tr>
+      <w:tr>
+        <w:tc>
+          <w:tcPr>
+            <w:tcW w:type="dxa" w:w="3060"/>
+            <w:tcMar>
+              <w:top w:type="dxa" w:w="80"/>
+              <w:left w:type="dxa" w:w="120"/>
+              <w:bottom w:type="dxa" w:w="80"/>
+              <w:right w:type="dxa" w:w="120"/>
+            </w:tcMar>
+          </w:tcPr>
+          <w:p>
+            <w:r>
+              <w:rPr>
+                <w:b w:val="false"/>
+                <w:bCs w:val="false"/>
+                <w:sz w:val="21"/>
+                <w:szCs w:val="21"/>
+              </w:rPr>
+              <w:t xml:space="preserve">CME Individual License Agreement</w:t>
+            </w:r>
+          </w:p>
+        </w:tc>
+        <w:tc>
+          <w:tcPr>
+            <w:tcW w:type="dxa" w:w="3700"/>
+            <w:tcMar>
+              <w:top w:type="dxa" w:w="80"/>
+              <w:left w:type="dxa" w:w="120"/>
+              <w:bottom w:type="dxa" w:w="80"/>
+              <w:right w:type="dxa" w:w="120"/>
+            </w:tcMar>
+          </w:tcPr>
+          <w:p>
+            <w:r>
+              <w:rPr>
+                <w:b w:val="false"/>
+                <w:bCs w:val="false"/>
+                <w:sz w:val="21"/>
+                <w:szCs w:val="21"/>
+              </w:rPr>
+              <w:t xml:space="preserve">Required to stream live quotes through an API; order placement alone does not require it</w:t>
+            </w:r>
+          </w:p>
+        </w:tc>
+        <w:tc>
+          <w:tcPr>
+            <w:tcW w:type="dxa" w:w="2600"/>
+            <w:tcMar>
+              <w:top w:type="dxa" w:w="80"/>
+              <w:left w:type="dxa" w:w="120"/>
+              <w:bottom w:type="dxa" w:w="80"/>
+              <w:right w:type="dxa" w:w="120"/>
+            </w:tcMar>
+          </w:tcPr>
+          <w:p>
+            <w:r>
+              <w:rPr>
+                <w:b w:val="false"/>
+                <w:bCs w:val="false"/>
+                <w:sz w:val="21"/>
+                <w:szCs w:val="21"/>
+              </w:rPr>
+              <w:t xml:space="preserve">≈ $290–500 / month</w:t>
+            </w:r>
+          </w:p>
+        </w:tc>
+      </w:tr>
+      <w:tr>
+        <w:tc>
+          <w:tcPr>
+            <w:tcW w:type="dxa" w:w="3060"/>
+            <w:tcMar>
+              <w:top w:type="dxa" w:w="80"/>
+              <w:left w:type="dxa" w:w="120"/>
+              <w:bottom w:type="dxa" w:w="80"/>
+              <w:right w:type="dxa" w:w="120"/>
+            </w:tcMar>
+          </w:tcPr>
+          <w:p>
+            <w:r>
+              <w:rPr>
+                <w:b w:val="false"/>
+                <w:bCs w:val="false"/>
+                <w:sz w:val="21"/>
+                <w:szCs w:val="21"/>
+              </w:rPr>
+              <w:t xml:space="preserve">Always-on server or VPS</w:t>
+            </w:r>
+          </w:p>
+        </w:tc>
+        <w:tc>
+          <w:tcPr>
+            <w:tcW w:type="dxa" w:w="3700"/>
+            <w:tcMar>
+              <w:top w:type="dxa" w:w="80"/>
+              <w:left w:type="dxa" w:w="120"/>
+              <w:bottom w:type="dxa" w:w="80"/>
+              <w:right w:type="dxa" w:w="120"/>
+            </w:tcMar>
+          </w:tcPr>
+          <w:p>
+            <w:r>
+              <w:rPr>
+                <w:b w:val="false"/>
+                <w:bCs w:val="false"/>
+                <w:sz w:val="21"/>
+                <w:szCs w:val="21"/>
+              </w:rPr>
+              <w:t xml:space="preserve">Runs the system unattended overnight and across both sessions</w:t>
+            </w:r>
+          </w:p>
+        </w:tc>
+        <w:tc>
+          <w:tcPr>
+            <w:tcW w:type="dxa" w:w="2600"/>
+            <w:tcMar>
+              <w:top w:type="dxa" w:w="80"/>
+              <w:left w:type="dxa" w:w="120"/>
+              <w:bottom w:type="dxa" w:w="80"/>
+              <w:right w:type="dxa" w:w="120"/>
+            </w:tcMar>
+          </w:tcPr>
+          <w:p>
+            <w:r>
+              <w:rPr>
+                <w:b w:val="false"/>
+                <w:bCs w:val="false"/>
+                <w:sz w:val="21"/>
+                <w:szCs w:val="21"/>
+              </w:rPr>
+              <w:t xml:space="preserve">≈ $20–100 / month</w:t>
+            </w:r>
+          </w:p>
+        </w:tc>
+      </w:tr>
+      <w:tr>
+        <w:tc>
+          <w:tcPr>
+            <w:tcW w:type="dxa" w:w="3060"/>
+            <w:shd w:fill="F4F4F4" w:color="auto" w:val="clear"/>
+            <w:tcMar>
+              <w:top w:type="dxa" w:w="80"/>
+              <w:left w:type="dxa" w:w="120"/>
+              <w:bottom w:type="dxa" w:w="80"/>
+              <w:right w:type="dxa" w:w="120"/>
+            </w:tcMar>
+          </w:tcPr>
+          <w:p>
+            <w:r>
+              <w:rPr>
+                <w:b/>
+                <w:bCs/>
+                <w:sz w:val="21"/>
+                <w:szCs w:val="21"/>
+              </w:rPr>
+              <w:t xml:space="preserve">Total</w:t>
+            </w:r>
+          </w:p>
+        </w:tc>
+        <w:tc>
+          <w:tcPr>
+            <w:tcW w:type="dxa" w:w="3700"/>
+            <w:shd w:fill="F4F4F4" w:color="auto" w:val="clear"/>
+            <w:tcMar>
+              <w:top w:type="dxa" w:w="80"/>
+              <w:left w:type="dxa" w:w="120"/>
+              <w:bottom w:type="dxa" w:w="80"/>
+              <w:right w:type="dxa" w:w="120"/>
+            </w:tcMar>
+          </w:tcPr>
+          <w:p>
+            <w:r>
+              <w:rPr>
+                <w:b w:val="false"/>
+                <w:bCs w:val="false"/>
+                <w:sz w:val="21"/>
+                <w:szCs w:val="21"/>
+              </w:rPr>
+              <w:t xml:space="preserve">Recurring cost of live operation</w:t>
+            </w:r>
+          </w:p>
+        </w:tc>
+        <w:tc>
+          <w:tcPr>
+            <w:tcW w:type="dxa" w:w="2600"/>
+            <w:shd w:fill="F4F4F4" w:color="auto" w:val="clear"/>
+            <w:tcMar>
+              <w:top w:type="dxa" w:w="80"/>
+              <w:left w:type="dxa" w:w="120"/>
+              <w:bottom w:type="dxa" w:w="80"/>
+              <w:right w:type="dxa" w:w="120"/>
+            </w:tcMar>
+          </w:tcPr>
+          <w:p>
+            <w:r>
+              <w:rPr>
+                <w:b/>
+                <w:bCs/>
+                <w:sz w:val="21"/>
+                <w:szCs w:val="21"/>
+              </w:rPr>
+              <w:t xml:space="preserve">≈ $420–760 / month, plus $1,000 capital</w:t>
+            </w:r>
+          </w:p>
+        </w:tc>
+      </w:tr>
+    </w:tbl>
+    <w:p>
+      <w:pPr>
+        <w:spacing w:after="120" w:line="276"/>
+      </w:pPr>
+      <w:r>
+        <w:rPr>
+          <w:sz w:val="22"/>
+          <w:szCs w:val="22"/>
+        </w:rPr>
+        <w:t xml:space="preserve">One further factor raises this figure for the researcher specifically. As of March 2026, CME Group began reclassifying funded proprietary-firm traders as “Professional” rather than “Non-Professional” subscribers. Professional status raises per-exchange market-data fees from roughly $12 per month to roughly $124 per month. Because the researcher holds a proprietary-firm account, the professional rate would apply, pushing the upper estimate higher still.</w:t>
+      </w:r>
+    </w:p>
+    <w:p>
+      <w:pPr>
+        <w:pStyle w:val="Heading2"/>
+        <w:spacing w:after="120" w:before="240"/>
+      </w:pPr>
+      <w:r>
+        <w:rPr>
+          <w:b/>
+          <w:bCs/>
+          <w:color w:val="333333"/>
+          <w:sz w:val="24"/>
+          <w:szCs w:val="24"/>
+        </w:rPr>
+        <w:t xml:space="preserve">Cost justification for the chosen design</w:t>
+      </w:r>
+    </w:p>
+    <w:p>
+      <w:pPr>
+        <w:spacing w:after="120" w:line="276"/>
+      </w:pPr>
+      <w:r>
+        <w:rPr>
+          <w:sz w:val="22"/>
+          <w:szCs w:val="22"/>
+        </w:rPr>
+        <w:t xml:space="preserve">The historical simulation costs approximately $30–105 as a single one-off payment. Live implementation would cost approximately $420–760 every month, or roughly $5,000–9,100 per year, before any capital is committed to trading. Live operation is therefore between fifty and three hundred times more expensive than the historical simulation, and the expense is recurring rather than one-off.</w:t>
+      </w:r>
+    </w:p>
+    <w:p>
+      <w:pPr>
+        <w:spacing w:after="120" w:line="276"/>
+      </w:pPr>
+      <w:r>
+        <w:rPr>
+          <w:sz w:val="22"/>
+          <w:szCs w:val="22"/>
+        </w:rPr>
+        <w:t xml:space="preserve">The historical design is also the stronger experiment independently of cost. All three arms replay the same 24 months of data, so every arm encounters identical market conditions. A live study would have to run the arms one after another, meaning each arm would trade a different period — a confounding variable that would weaken every comparison drawn between them. The historical design removes that confound entirely and is fully reproducible by another researcher, which a live forward test can never be.</w:t>
+      </w:r>
+    </w:p>
+    <w:p>
+      <w:pPr>
+        <w:spacing w:after="120" w:line="276"/>
+      </w:pPr>
+      <w:r>
+        <w:rPr>
+          <w:i/>
+          <w:iCs/>
+          <w:sz w:val="22"/>
+          <w:szCs w:val="22"/>
+        </w:rPr>
+        <w:t xml:space="preserve">Limitation of these estimates: the figures above are taken from published broker and vendor pricing at the time of writing and are quoted as ranges because they vary by exchange, subscriber classification, and vendor package. They should be verified directly with the providers before any money is committed.</w:t>
       </w:r>
     </w:p>
     <w:p>

</xml_diff>